<commit_message>
1 teste de produção
</commit_message>
<xml_diff>
--- a/media/modelo_edital.docx
+++ b/media/modelo_edital.docx
@@ -1,12 +1,12 @@
 
 <file path=word/document.xml><?xml version="1.0" encoding="utf-8"?>
-<w:document xmlns:wpc="http://schemas.microsoft.com/office/word/2010/wordprocessingCanvas" xmlns:cx="http://schemas.microsoft.com/office/drawing/2014/chartex" xmlns:cx1="http://schemas.microsoft.com/office/drawing/2015/9/8/chartex" xmlns:cx2="http://schemas.microsoft.com/office/drawing/2015/10/21/chartex" xmlns:cx3="http://schemas.microsoft.com/office/drawing/2016/5/9/chartex" xmlns:cx4="http://schemas.microsoft.com/office/drawing/2016/5/10/chartex" xmlns:cx5="http://schemas.microsoft.com/office/drawing/2016/5/11/chartex" xmlns:cx6="http://schemas.microsoft.com/office/drawing/2016/5/12/chartex" xmlns:cx7="http://schemas.microsoft.com/office/drawing/2016/5/13/chartex" xmlns:cx8="http://schemas.microsoft.com/office/drawing/2016/5/14/chartex" xmlns:mc="http://schemas.openxmlformats.org/markup-compatibility/2006" xmlns:aink="http://schemas.microsoft.com/office/drawing/2016/ink" xmlns:am3d="http://schemas.microsoft.com/office/drawing/2017/model3d" xmlns:o="urn:schemas-microsoft-com:office:office" xmlns:oel="http://schemas.microsoft.com/office/2019/extlst" xmlns:r="http://schemas.openxmlformats.org/officeDocument/2006/relationships" xmlns:m="http://schemas.openxmlformats.org/officeDocument/2006/math" xmlns:v="urn:schemas-microsoft-com:vml" xmlns:wp14="http://schemas.microsoft.com/office/word/2010/wordprocessingDrawing" xmlns:wp="http://schemas.openxmlformats.org/drawingml/2006/wordprocessingDrawing" xmlns:w10="urn:schemas-microsoft-com:office:word" xmlns:w="http://schemas.openxmlformats.org/wordprocessingml/2006/main" xmlns:w14="http://schemas.microsoft.com/office/word/2010/wordml" xmlns:w15="http://schemas.microsoft.com/office/word/2012/wordml" xmlns:w16cex="http://schemas.microsoft.com/office/word/2018/wordml/cex" xmlns:w16cid="http://schemas.microsoft.com/office/word/2016/wordml/cid" xmlns:w16="http://schemas.microsoft.com/office/word/2018/wordml" xmlns:w16du="http://schemas.microsoft.com/office/word/2023/wordml/word16du" xmlns:w16sdtdh="http://schemas.microsoft.com/office/word/2020/wordml/sdtdatahash" xmlns:w16sdtfl="http://schemas.microsoft.com/office/word/2024/wordml/sdtformatlock" xmlns:w16se="http://schemas.microsoft.com/office/word/2015/wordml/symex" xmlns:wpg="http://schemas.microsoft.com/office/word/2010/wordprocessingGroup" xmlns:wpi="http://schemas.microsoft.com/office/word/2010/wordprocessingInk" xmlns:wne="http://schemas.microsoft.com/office/word/2006/wordml" xmlns:wps="http://schemas.microsoft.com/office/word/2010/wordprocessingShape" mc:Ignorable="w14 w15 w16se w16cid w16 w16cex w16sdtdh w16sdtfl w16du wp14">
+<w:document xmlns:wpc="http://schemas.microsoft.com/office/word/2010/wordprocessingCanvas" xmlns:cx="http://schemas.microsoft.com/office/drawing/2014/chartex" xmlns:cx1="http://schemas.microsoft.com/office/drawing/2015/9/8/chartex" xmlns:cx2="http://schemas.microsoft.com/office/drawing/2015/10/21/chartex" xmlns:cx3="http://schemas.microsoft.com/office/drawing/2016/5/9/chartex" xmlns:cx4="http://schemas.microsoft.com/office/drawing/2016/5/10/chartex" xmlns:cx5="http://schemas.microsoft.com/office/drawing/2016/5/11/chartex" xmlns:cx6="http://schemas.microsoft.com/office/drawing/2016/5/12/chartex" xmlns:cx7="http://schemas.microsoft.com/office/drawing/2016/5/13/chartex" xmlns:cx8="http://schemas.microsoft.com/office/drawing/2016/5/14/chartex" xmlns:mc="http://schemas.openxmlformats.org/markup-compatibility/2006" xmlns:aink="http://schemas.microsoft.com/office/drawing/2016/ink" xmlns:am3d="http://schemas.microsoft.com/office/drawing/2017/model3d" xmlns:o="urn:schemas-microsoft-com:office:office" xmlns:r="http://schemas.openxmlformats.org/officeDocument/2006/relationships" xmlns:m="http://schemas.openxmlformats.org/officeDocument/2006/math" xmlns:v="urn:schemas-microsoft-com:vml" xmlns:wp14="http://schemas.microsoft.com/office/word/2010/wordprocessingDrawing" xmlns:wp="http://schemas.openxmlformats.org/drawingml/2006/wordprocessingDrawing" xmlns:w10="urn:schemas-microsoft-com:office:word" xmlns:w="http://schemas.openxmlformats.org/wordprocessingml/2006/main" xmlns:w14="http://schemas.microsoft.com/office/word/2010/wordml" xmlns:w15="http://schemas.microsoft.com/office/word/2012/wordml" xmlns:w16cex="http://schemas.microsoft.com/office/word/2018/wordml/cex" xmlns:w16cid="http://schemas.microsoft.com/office/word/2016/wordml/cid" xmlns:w16="http://schemas.microsoft.com/office/word/2018/wordml" xmlns:w16sdtdh="http://schemas.microsoft.com/office/word/2020/wordml/sdtdatahash" xmlns:w16se="http://schemas.microsoft.com/office/word/2015/wordml/symex" xmlns:wpg="http://schemas.microsoft.com/office/word/2010/wordprocessingGroup" xmlns:wpi="http://schemas.microsoft.com/office/word/2010/wordprocessingInk" xmlns:wne="http://schemas.microsoft.com/office/word/2006/wordml" xmlns:wps="http://schemas.microsoft.com/office/word/2010/wordprocessingShape" mc:Ignorable="w14 w15 w16se w16cid w16 w16cex w16sdtdh wp14">
   <w:body>
     <w:p>
       <w:pPr>
         <w:spacing w:line="360" w:lineRule="auto"/>
         <w:rPr>
-          <w:rStyle w:val="SubtleEmphasis"/>
+          <w:rStyle w:val="nfaseSutil"/>
           <w:rFonts w:ascii="Verdana" w:hAnsi="Verdana"/>
           <w:b/>
           <w:bCs/>
@@ -18,7 +18,7 @@
       </w:pPr>
       <w:r>
         <w:rPr>
-          <w:rStyle w:val="SubtleEmphasis"/>
+          <w:rStyle w:val="nfaseSutil"/>
           <w:rFonts w:ascii="Verdana" w:hAnsi="Verdana"/>
           <w:b/>
           <w:bCs/>
@@ -31,7 +31,7 @@
       </w:r>
       <w:r>
         <w:rPr>
-          <w:rStyle w:val="SubtleEmphasis"/>
+          <w:rStyle w:val="nfaseSutil"/>
           <w:rFonts w:ascii="Verdana" w:hAnsi="Verdana"/>
           <w:b/>
           <w:bCs/>
@@ -44,7 +44,7 @@
       </w:r>
       <w:r>
         <w:rPr>
-          <w:rStyle w:val="SubtleEmphasis"/>
+          <w:rStyle w:val="nfaseSutil"/>
           <w:rFonts w:ascii="Verdana" w:hAnsi="Verdana"/>
           <w:b/>
           <w:bCs/>
@@ -61,7 +61,7 @@
         <w:spacing w:line="360" w:lineRule="auto"/>
         <w:jc w:val="center"/>
         <w:rPr>
-          <w:rStyle w:val="SubtleEmphasis"/>
+          <w:rStyle w:val="nfaseSutil"/>
           <w:rFonts w:ascii="Verdana" w:hAnsi="Verdana"/>
           <w:b/>
           <w:bCs/>
@@ -71,7 +71,7 @@
       </w:pPr>
       <w:r>
         <w:rPr>
-          <w:rStyle w:val="SubtleEmphasis"/>
+          <w:rStyle w:val="nfaseSutil"/>
           <w:rFonts w:ascii="Verdana" w:hAnsi="Verdana"/>
           <w:b/>
           <w:bCs/>
@@ -509,7 +509,7 @@
           <w:sz w:val="22"/>
           <w:szCs w:val="22"/>
         </w:rPr>
-        <w:t>Rafael Carvalho do Nascimento</w:t>
+        <w:t>Alexandre Leal da Assunção</w:t>
       </w:r>
     </w:p>
     <w:p>
@@ -528,7 +528,16 @@
           <w:sz w:val="22"/>
           <w:szCs w:val="22"/>
         </w:rPr>
-        <w:t>Secretário de Segurança Urbana</w:t>
+        <w:t>Autoridade de Trânsito Municipal</w:t>
+      </w:r>
+      <w:r>
+        <w:rPr>
+          <w:rFonts w:ascii="Verdana" w:hAnsi="Verdana"/>
+          <w:sz w:val="22"/>
+          <w:szCs w:val="22"/>
+        </w:rPr>
+        <w:br/>
+        <w:t>Diretor do Departamento de Trânsito Municipal</w:t>
       </w:r>
     </w:p>
     <w:p>
@@ -614,7 +623,7 @@
 </file>
 
 <file path=word/endnotes.xml><?xml version="1.0" encoding="utf-8"?>
-<w:endnotes xmlns:wpc="http://schemas.microsoft.com/office/word/2010/wordprocessingCanvas" xmlns:cx="http://schemas.microsoft.com/office/drawing/2014/chartex" xmlns:cx1="http://schemas.microsoft.com/office/drawing/2015/9/8/chartex" xmlns:cx2="http://schemas.microsoft.com/office/drawing/2015/10/21/chartex" xmlns:cx3="http://schemas.microsoft.com/office/drawing/2016/5/9/chartex" xmlns:cx4="http://schemas.microsoft.com/office/drawing/2016/5/10/chartex" xmlns:cx5="http://schemas.microsoft.com/office/drawing/2016/5/11/chartex" xmlns:cx6="http://schemas.microsoft.com/office/drawing/2016/5/12/chartex" xmlns:cx7="http://schemas.microsoft.com/office/drawing/2016/5/13/chartex" xmlns:cx8="http://schemas.microsoft.com/office/drawing/2016/5/14/chartex" xmlns:mc="http://schemas.openxmlformats.org/markup-compatibility/2006" xmlns:aink="http://schemas.microsoft.com/office/drawing/2016/ink" xmlns:am3d="http://schemas.microsoft.com/office/drawing/2017/model3d" xmlns:o="urn:schemas-microsoft-com:office:office" xmlns:oel="http://schemas.microsoft.com/office/2019/extlst" xmlns:r="http://schemas.openxmlformats.org/officeDocument/2006/relationships" xmlns:m="http://schemas.openxmlformats.org/officeDocument/2006/math" xmlns:v="urn:schemas-microsoft-com:vml" xmlns:wp14="http://schemas.microsoft.com/office/word/2010/wordprocessingDrawing" xmlns:wp="http://schemas.openxmlformats.org/drawingml/2006/wordprocessingDrawing" xmlns:w10="urn:schemas-microsoft-com:office:word" xmlns:w="http://schemas.openxmlformats.org/wordprocessingml/2006/main" xmlns:w14="http://schemas.microsoft.com/office/word/2010/wordml" xmlns:w15="http://schemas.microsoft.com/office/word/2012/wordml" xmlns:w16cex="http://schemas.microsoft.com/office/word/2018/wordml/cex" xmlns:w16cid="http://schemas.microsoft.com/office/word/2016/wordml/cid" xmlns:w16="http://schemas.microsoft.com/office/word/2018/wordml" xmlns:w16du="http://schemas.microsoft.com/office/word/2023/wordml/word16du" xmlns:w16sdtdh="http://schemas.microsoft.com/office/word/2020/wordml/sdtdatahash" xmlns:w16sdtfl="http://schemas.microsoft.com/office/word/2024/wordml/sdtformatlock" xmlns:w16se="http://schemas.microsoft.com/office/word/2015/wordml/symex" xmlns:wpg="http://schemas.microsoft.com/office/word/2010/wordprocessingGroup" xmlns:wpi="http://schemas.microsoft.com/office/word/2010/wordprocessingInk" xmlns:wne="http://schemas.microsoft.com/office/word/2006/wordml" xmlns:wps="http://schemas.microsoft.com/office/word/2010/wordprocessingShape" mc:Ignorable="w14 w15 w16se w16cid w16 w16cex w16sdtdh w16sdtfl w16du wp14">
+<w:endnotes xmlns:wpc="http://schemas.microsoft.com/office/word/2010/wordprocessingCanvas" xmlns:cx="http://schemas.microsoft.com/office/drawing/2014/chartex" xmlns:cx1="http://schemas.microsoft.com/office/drawing/2015/9/8/chartex" xmlns:cx2="http://schemas.microsoft.com/office/drawing/2015/10/21/chartex" xmlns:cx3="http://schemas.microsoft.com/office/drawing/2016/5/9/chartex" xmlns:cx4="http://schemas.microsoft.com/office/drawing/2016/5/10/chartex" xmlns:cx5="http://schemas.microsoft.com/office/drawing/2016/5/11/chartex" xmlns:cx6="http://schemas.microsoft.com/office/drawing/2016/5/12/chartex" xmlns:cx7="http://schemas.microsoft.com/office/drawing/2016/5/13/chartex" xmlns:cx8="http://schemas.microsoft.com/office/drawing/2016/5/14/chartex" xmlns:mc="http://schemas.openxmlformats.org/markup-compatibility/2006" xmlns:aink="http://schemas.microsoft.com/office/drawing/2016/ink" xmlns:am3d="http://schemas.microsoft.com/office/drawing/2017/model3d" xmlns:o="urn:schemas-microsoft-com:office:office" xmlns:r="http://schemas.openxmlformats.org/officeDocument/2006/relationships" xmlns:m="http://schemas.openxmlformats.org/officeDocument/2006/math" xmlns:v="urn:schemas-microsoft-com:vml" xmlns:wp14="http://schemas.microsoft.com/office/word/2010/wordprocessingDrawing" xmlns:wp="http://schemas.openxmlformats.org/drawingml/2006/wordprocessingDrawing" xmlns:w10="urn:schemas-microsoft-com:office:word" xmlns:w="http://schemas.openxmlformats.org/wordprocessingml/2006/main" xmlns:w14="http://schemas.microsoft.com/office/word/2010/wordml" xmlns:w15="http://schemas.microsoft.com/office/word/2012/wordml" xmlns:w16cex="http://schemas.microsoft.com/office/word/2018/wordml/cex" xmlns:w16cid="http://schemas.microsoft.com/office/word/2016/wordml/cid" xmlns:w16="http://schemas.microsoft.com/office/word/2018/wordml" xmlns:w16sdtdh="http://schemas.microsoft.com/office/word/2020/wordml/sdtdatahash" xmlns:w16se="http://schemas.microsoft.com/office/word/2015/wordml/symex" xmlns:wpg="http://schemas.microsoft.com/office/word/2010/wordprocessingGroup" xmlns:wpi="http://schemas.microsoft.com/office/word/2010/wordprocessingInk" xmlns:wne="http://schemas.microsoft.com/office/word/2006/wordml" xmlns:wps="http://schemas.microsoft.com/office/word/2010/wordprocessingShape" mc:Ignorable="w14 w15 w16se w16cid w16 w16cex w16sdtdh wp14">
   <w:endnote w:type="separator" w:id="-1">
     <w:p>
       <w:r>
@@ -633,10 +642,10 @@
 </file>
 
 <file path=word/footer1.xml><?xml version="1.0" encoding="utf-8"?>
-<w:ftr xmlns:wpc="http://schemas.microsoft.com/office/word/2010/wordprocessingCanvas" xmlns:cx="http://schemas.microsoft.com/office/drawing/2014/chartex" xmlns:cx1="http://schemas.microsoft.com/office/drawing/2015/9/8/chartex" xmlns:cx2="http://schemas.microsoft.com/office/drawing/2015/10/21/chartex" xmlns:cx3="http://schemas.microsoft.com/office/drawing/2016/5/9/chartex" xmlns:cx4="http://schemas.microsoft.com/office/drawing/2016/5/10/chartex" xmlns:cx5="http://schemas.microsoft.com/office/drawing/2016/5/11/chartex" xmlns:cx6="http://schemas.microsoft.com/office/drawing/2016/5/12/chartex" xmlns:cx7="http://schemas.microsoft.com/office/drawing/2016/5/13/chartex" xmlns:cx8="http://schemas.microsoft.com/office/drawing/2016/5/14/chartex" xmlns:mc="http://schemas.openxmlformats.org/markup-compatibility/2006" xmlns:aink="http://schemas.microsoft.com/office/drawing/2016/ink" xmlns:am3d="http://schemas.microsoft.com/office/drawing/2017/model3d" xmlns:o="urn:schemas-microsoft-com:office:office" xmlns:oel="http://schemas.microsoft.com/office/2019/extlst" xmlns:r="http://schemas.openxmlformats.org/officeDocument/2006/relationships" xmlns:m="http://schemas.openxmlformats.org/officeDocument/2006/math" xmlns:v="urn:schemas-microsoft-com:vml" xmlns:wp14="http://schemas.microsoft.com/office/word/2010/wordprocessingDrawing" xmlns:wp="http://schemas.openxmlformats.org/drawingml/2006/wordprocessingDrawing" xmlns:w10="urn:schemas-microsoft-com:office:word" xmlns:w="http://schemas.openxmlformats.org/wordprocessingml/2006/main" xmlns:w14="http://schemas.microsoft.com/office/word/2010/wordml" xmlns:w15="http://schemas.microsoft.com/office/word/2012/wordml" xmlns:w16cex="http://schemas.microsoft.com/office/word/2018/wordml/cex" xmlns:w16cid="http://schemas.microsoft.com/office/word/2016/wordml/cid" xmlns:w16="http://schemas.microsoft.com/office/word/2018/wordml" xmlns:w16du="http://schemas.microsoft.com/office/word/2023/wordml/word16du" xmlns:w16sdtdh="http://schemas.microsoft.com/office/word/2020/wordml/sdtdatahash" xmlns:w16sdtfl="http://schemas.microsoft.com/office/word/2024/wordml/sdtformatlock" xmlns:w16se="http://schemas.microsoft.com/office/word/2015/wordml/symex" xmlns:wpg="http://schemas.microsoft.com/office/word/2010/wordprocessingGroup" xmlns:wpi="http://schemas.microsoft.com/office/word/2010/wordprocessingInk" xmlns:wne="http://schemas.microsoft.com/office/word/2006/wordml" xmlns:wps="http://schemas.microsoft.com/office/word/2010/wordprocessingShape" mc:Ignorable="w14 w15 w16se w16cid w16 w16cex w16sdtdh w16sdtfl w16du wp14">
+<w:ftr xmlns:wpc="http://schemas.microsoft.com/office/word/2010/wordprocessingCanvas" xmlns:cx="http://schemas.microsoft.com/office/drawing/2014/chartex" xmlns:cx1="http://schemas.microsoft.com/office/drawing/2015/9/8/chartex" xmlns:cx2="http://schemas.microsoft.com/office/drawing/2015/10/21/chartex" xmlns:cx3="http://schemas.microsoft.com/office/drawing/2016/5/9/chartex" xmlns:cx4="http://schemas.microsoft.com/office/drawing/2016/5/10/chartex" xmlns:cx5="http://schemas.microsoft.com/office/drawing/2016/5/11/chartex" xmlns:cx6="http://schemas.microsoft.com/office/drawing/2016/5/12/chartex" xmlns:cx7="http://schemas.microsoft.com/office/drawing/2016/5/13/chartex" xmlns:cx8="http://schemas.microsoft.com/office/drawing/2016/5/14/chartex" xmlns:mc="http://schemas.openxmlformats.org/markup-compatibility/2006" xmlns:aink="http://schemas.microsoft.com/office/drawing/2016/ink" xmlns:am3d="http://schemas.microsoft.com/office/drawing/2017/model3d" xmlns:o="urn:schemas-microsoft-com:office:office" xmlns:r="http://schemas.openxmlformats.org/officeDocument/2006/relationships" xmlns:m="http://schemas.openxmlformats.org/officeDocument/2006/math" xmlns:v="urn:schemas-microsoft-com:vml" xmlns:wp14="http://schemas.microsoft.com/office/word/2010/wordprocessingDrawing" xmlns:wp="http://schemas.openxmlformats.org/drawingml/2006/wordprocessingDrawing" xmlns:w10="urn:schemas-microsoft-com:office:word" xmlns:w="http://schemas.openxmlformats.org/wordprocessingml/2006/main" xmlns:w14="http://schemas.microsoft.com/office/word/2010/wordml" xmlns:w15="http://schemas.microsoft.com/office/word/2012/wordml" xmlns:w16cex="http://schemas.microsoft.com/office/word/2018/wordml/cex" xmlns:w16cid="http://schemas.microsoft.com/office/word/2016/wordml/cid" xmlns:w16="http://schemas.microsoft.com/office/word/2018/wordml" xmlns:w16sdtdh="http://schemas.microsoft.com/office/word/2020/wordml/sdtdatahash" xmlns:w16se="http://schemas.microsoft.com/office/word/2015/wordml/symex" xmlns:wpg="http://schemas.microsoft.com/office/word/2010/wordprocessingGroup" xmlns:wpi="http://schemas.microsoft.com/office/word/2010/wordprocessingInk" xmlns:wne="http://schemas.microsoft.com/office/word/2006/wordml" xmlns:wps="http://schemas.microsoft.com/office/word/2010/wordprocessingShape" mc:Ignorable="w14 w15 w16se w16cid w16 w16cex w16sdtdh wp14">
   <w:p>
     <w:pPr>
-      <w:pStyle w:val="Footer"/>
+      <w:pStyle w:val="Rodap"/>
       <w:spacing w:line="276" w:lineRule="auto"/>
       <w:jc w:val="center"/>
       <w:rPr>
@@ -648,7 +657,7 @@
   </w:p>
   <w:p>
     <w:pPr>
-      <w:pStyle w:val="Footer"/>
+      <w:pStyle w:val="Rodap"/>
       <w:spacing w:line="276" w:lineRule="auto"/>
       <w:jc w:val="center"/>
       <w:rPr>
@@ -660,7 +669,7 @@
   </w:p>
   <w:p>
     <w:pPr>
-      <w:pStyle w:val="Footer"/>
+      <w:pStyle w:val="Rodap"/>
       <w:spacing w:line="276" w:lineRule="auto"/>
       <w:jc w:val="center"/>
       <w:rPr>
@@ -744,7 +753,7 @@
   </w:p>
   <w:p>
     <w:pPr>
-      <w:pStyle w:val="Footer"/>
+      <w:pStyle w:val="Rodap"/>
       <w:spacing w:line="276" w:lineRule="auto"/>
       <w:jc w:val="center"/>
       <w:rPr>
@@ -756,7 +765,7 @@
   </w:p>
   <w:p>
     <w:pPr>
-      <w:pStyle w:val="Footer"/>
+      <w:pStyle w:val="Rodap"/>
       <w:spacing w:line="276" w:lineRule="auto"/>
       <w:jc w:val="center"/>
       <w:rPr>
@@ -768,7 +777,7 @@
   </w:p>
   <w:p>
     <w:pPr>
-      <w:pStyle w:val="Footer"/>
+      <w:pStyle w:val="Rodap"/>
       <w:spacing w:line="276" w:lineRule="auto"/>
       <w:jc w:val="center"/>
       <w:rPr>
@@ -780,7 +789,7 @@
   </w:p>
   <w:p>
     <w:pPr>
-      <w:pStyle w:val="Footer"/>
+      <w:pStyle w:val="Rodap"/>
       <w:spacing w:line="276" w:lineRule="auto"/>
       <w:jc w:val="center"/>
       <w:rPr>
@@ -862,7 +871,7 @@
   </w:p>
   <w:p>
     <w:pPr>
-      <w:pStyle w:val="Footer"/>
+      <w:pStyle w:val="Rodap"/>
       <w:spacing w:line="276" w:lineRule="auto"/>
       <w:jc w:val="center"/>
       <w:rPr>
@@ -877,20 +886,12 @@
         <w:sz w:val="16"/>
         <w:szCs w:val="16"/>
       </w:rPr>
-      <w:t xml:space="preserve">R. </w:t>
-    </w:r>
-    <w:r>
-      <w:rPr>
-        <w:rFonts w:ascii="Verdana" w:hAnsi="Verdana" w:cs="Arial"/>
-        <w:sz w:val="16"/>
-        <w:szCs w:val="16"/>
-      </w:rPr>
-      <w:t>Amazonas, nº 84 | Vila Industrial | CEP 11609-509 | São Sebastião-SP</w:t>
+      <w:t>R. Amazonas, nº 84 | Vila Industrial | CEP 11609-509 | São Sebastião-SP</w:t>
     </w:r>
   </w:p>
   <w:p>
     <w:pPr>
-      <w:pStyle w:val="Footer"/>
+      <w:pStyle w:val="Rodap"/>
       <w:spacing w:line="276" w:lineRule="auto"/>
       <w:jc w:val="center"/>
       <w:rPr>
@@ -912,7 +913,7 @@
 </file>
 
 <file path=word/footnotes.xml><?xml version="1.0" encoding="utf-8"?>
-<w:footnotes xmlns:wpc="http://schemas.microsoft.com/office/word/2010/wordprocessingCanvas" xmlns:cx="http://schemas.microsoft.com/office/drawing/2014/chartex" xmlns:cx1="http://schemas.microsoft.com/office/drawing/2015/9/8/chartex" xmlns:cx2="http://schemas.microsoft.com/office/drawing/2015/10/21/chartex" xmlns:cx3="http://schemas.microsoft.com/office/drawing/2016/5/9/chartex" xmlns:cx4="http://schemas.microsoft.com/office/drawing/2016/5/10/chartex" xmlns:cx5="http://schemas.microsoft.com/office/drawing/2016/5/11/chartex" xmlns:cx6="http://schemas.microsoft.com/office/drawing/2016/5/12/chartex" xmlns:cx7="http://schemas.microsoft.com/office/drawing/2016/5/13/chartex" xmlns:cx8="http://schemas.microsoft.com/office/drawing/2016/5/14/chartex" xmlns:mc="http://schemas.openxmlformats.org/markup-compatibility/2006" xmlns:aink="http://schemas.microsoft.com/office/drawing/2016/ink" xmlns:am3d="http://schemas.microsoft.com/office/drawing/2017/model3d" xmlns:o="urn:schemas-microsoft-com:office:office" xmlns:oel="http://schemas.microsoft.com/office/2019/extlst" xmlns:r="http://schemas.openxmlformats.org/officeDocument/2006/relationships" xmlns:m="http://schemas.openxmlformats.org/officeDocument/2006/math" xmlns:v="urn:schemas-microsoft-com:vml" xmlns:wp14="http://schemas.microsoft.com/office/word/2010/wordprocessingDrawing" xmlns:wp="http://schemas.openxmlformats.org/drawingml/2006/wordprocessingDrawing" xmlns:w10="urn:schemas-microsoft-com:office:word" xmlns:w="http://schemas.openxmlformats.org/wordprocessingml/2006/main" xmlns:w14="http://schemas.microsoft.com/office/word/2010/wordml" xmlns:w15="http://schemas.microsoft.com/office/word/2012/wordml" xmlns:w16cex="http://schemas.microsoft.com/office/word/2018/wordml/cex" xmlns:w16cid="http://schemas.microsoft.com/office/word/2016/wordml/cid" xmlns:w16="http://schemas.microsoft.com/office/word/2018/wordml" xmlns:w16du="http://schemas.microsoft.com/office/word/2023/wordml/word16du" xmlns:w16sdtdh="http://schemas.microsoft.com/office/word/2020/wordml/sdtdatahash" xmlns:w16sdtfl="http://schemas.microsoft.com/office/word/2024/wordml/sdtformatlock" xmlns:w16se="http://schemas.microsoft.com/office/word/2015/wordml/symex" xmlns:wpg="http://schemas.microsoft.com/office/word/2010/wordprocessingGroup" xmlns:wpi="http://schemas.microsoft.com/office/word/2010/wordprocessingInk" xmlns:wne="http://schemas.microsoft.com/office/word/2006/wordml" xmlns:wps="http://schemas.microsoft.com/office/word/2010/wordprocessingShape" mc:Ignorable="w14 w15 w16se w16cid w16 w16cex w16sdtdh w16sdtfl w16du wp14">
+<w:footnotes xmlns:wpc="http://schemas.microsoft.com/office/word/2010/wordprocessingCanvas" xmlns:cx="http://schemas.microsoft.com/office/drawing/2014/chartex" xmlns:cx1="http://schemas.microsoft.com/office/drawing/2015/9/8/chartex" xmlns:cx2="http://schemas.microsoft.com/office/drawing/2015/10/21/chartex" xmlns:cx3="http://schemas.microsoft.com/office/drawing/2016/5/9/chartex" xmlns:cx4="http://schemas.microsoft.com/office/drawing/2016/5/10/chartex" xmlns:cx5="http://schemas.microsoft.com/office/drawing/2016/5/11/chartex" xmlns:cx6="http://schemas.microsoft.com/office/drawing/2016/5/12/chartex" xmlns:cx7="http://schemas.microsoft.com/office/drawing/2016/5/13/chartex" xmlns:cx8="http://schemas.microsoft.com/office/drawing/2016/5/14/chartex" xmlns:mc="http://schemas.openxmlformats.org/markup-compatibility/2006" xmlns:aink="http://schemas.microsoft.com/office/drawing/2016/ink" xmlns:am3d="http://schemas.microsoft.com/office/drawing/2017/model3d" xmlns:o="urn:schemas-microsoft-com:office:office" xmlns:r="http://schemas.openxmlformats.org/officeDocument/2006/relationships" xmlns:m="http://schemas.openxmlformats.org/officeDocument/2006/math" xmlns:v="urn:schemas-microsoft-com:vml" xmlns:wp14="http://schemas.microsoft.com/office/word/2010/wordprocessingDrawing" xmlns:wp="http://schemas.openxmlformats.org/drawingml/2006/wordprocessingDrawing" xmlns:w10="urn:schemas-microsoft-com:office:word" xmlns:w="http://schemas.openxmlformats.org/wordprocessingml/2006/main" xmlns:w14="http://schemas.microsoft.com/office/word/2010/wordml" xmlns:w15="http://schemas.microsoft.com/office/word/2012/wordml" xmlns:w16cex="http://schemas.microsoft.com/office/word/2018/wordml/cex" xmlns:w16cid="http://schemas.microsoft.com/office/word/2016/wordml/cid" xmlns:w16="http://schemas.microsoft.com/office/word/2018/wordml" xmlns:w16sdtdh="http://schemas.microsoft.com/office/word/2020/wordml/sdtdatahash" xmlns:w16se="http://schemas.microsoft.com/office/word/2015/wordml/symex" xmlns:wpg="http://schemas.microsoft.com/office/word/2010/wordprocessingGroup" xmlns:wpi="http://schemas.microsoft.com/office/word/2010/wordprocessingInk" xmlns:wne="http://schemas.microsoft.com/office/word/2006/wordml" xmlns:wps="http://schemas.microsoft.com/office/word/2010/wordprocessingShape" mc:Ignorable="w14 w15 w16se w16cid w16 w16cex w16sdtdh wp14">
   <w:footnote w:type="separator" w:id="-1">
     <w:p>
       <w:r>
@@ -931,10 +932,10 @@
 </file>
 
 <file path=word/header1.xml><?xml version="1.0" encoding="utf-8"?>
-<w:hdr xmlns:wpc="http://schemas.microsoft.com/office/word/2010/wordprocessingCanvas" xmlns:cx="http://schemas.microsoft.com/office/drawing/2014/chartex" xmlns:cx1="http://schemas.microsoft.com/office/drawing/2015/9/8/chartex" xmlns:cx2="http://schemas.microsoft.com/office/drawing/2015/10/21/chartex" xmlns:cx3="http://schemas.microsoft.com/office/drawing/2016/5/9/chartex" xmlns:cx4="http://schemas.microsoft.com/office/drawing/2016/5/10/chartex" xmlns:cx5="http://schemas.microsoft.com/office/drawing/2016/5/11/chartex" xmlns:cx6="http://schemas.microsoft.com/office/drawing/2016/5/12/chartex" xmlns:cx7="http://schemas.microsoft.com/office/drawing/2016/5/13/chartex" xmlns:cx8="http://schemas.microsoft.com/office/drawing/2016/5/14/chartex" xmlns:mc="http://schemas.openxmlformats.org/markup-compatibility/2006" xmlns:aink="http://schemas.microsoft.com/office/drawing/2016/ink" xmlns:am3d="http://schemas.microsoft.com/office/drawing/2017/model3d" xmlns:o="urn:schemas-microsoft-com:office:office" xmlns:oel="http://schemas.microsoft.com/office/2019/extlst" xmlns:r="http://schemas.openxmlformats.org/officeDocument/2006/relationships" xmlns:m="http://schemas.openxmlformats.org/officeDocument/2006/math" xmlns:v="urn:schemas-microsoft-com:vml" xmlns:wp14="http://schemas.microsoft.com/office/word/2010/wordprocessingDrawing" xmlns:wp="http://schemas.openxmlformats.org/drawingml/2006/wordprocessingDrawing" xmlns:w10="urn:schemas-microsoft-com:office:word" xmlns:w="http://schemas.openxmlformats.org/wordprocessingml/2006/main" xmlns:w14="http://schemas.microsoft.com/office/word/2010/wordml" xmlns:w15="http://schemas.microsoft.com/office/word/2012/wordml" xmlns:w16cex="http://schemas.microsoft.com/office/word/2018/wordml/cex" xmlns:w16cid="http://schemas.microsoft.com/office/word/2016/wordml/cid" xmlns:w16="http://schemas.microsoft.com/office/word/2018/wordml" xmlns:w16du="http://schemas.microsoft.com/office/word/2023/wordml/word16du" xmlns:w16sdtdh="http://schemas.microsoft.com/office/word/2020/wordml/sdtdatahash" xmlns:w16sdtfl="http://schemas.microsoft.com/office/word/2024/wordml/sdtformatlock" xmlns:w16se="http://schemas.microsoft.com/office/word/2015/wordml/symex" xmlns:wpg="http://schemas.microsoft.com/office/word/2010/wordprocessingGroup" xmlns:wpi="http://schemas.microsoft.com/office/word/2010/wordprocessingInk" xmlns:wne="http://schemas.microsoft.com/office/word/2006/wordml" xmlns:wps="http://schemas.microsoft.com/office/word/2010/wordprocessingShape" mc:Ignorable="w14 w15 w16se w16cid w16 w16cex w16sdtdh w16sdtfl w16du wp14">
+<w:hdr xmlns:wpc="http://schemas.microsoft.com/office/word/2010/wordprocessingCanvas" xmlns:cx="http://schemas.microsoft.com/office/drawing/2014/chartex" xmlns:cx1="http://schemas.microsoft.com/office/drawing/2015/9/8/chartex" xmlns:cx2="http://schemas.microsoft.com/office/drawing/2015/10/21/chartex" xmlns:cx3="http://schemas.microsoft.com/office/drawing/2016/5/9/chartex" xmlns:cx4="http://schemas.microsoft.com/office/drawing/2016/5/10/chartex" xmlns:cx5="http://schemas.microsoft.com/office/drawing/2016/5/11/chartex" xmlns:cx6="http://schemas.microsoft.com/office/drawing/2016/5/12/chartex" xmlns:cx7="http://schemas.microsoft.com/office/drawing/2016/5/13/chartex" xmlns:cx8="http://schemas.microsoft.com/office/drawing/2016/5/14/chartex" xmlns:mc="http://schemas.openxmlformats.org/markup-compatibility/2006" xmlns:aink="http://schemas.microsoft.com/office/drawing/2016/ink" xmlns:am3d="http://schemas.microsoft.com/office/drawing/2017/model3d" xmlns:o="urn:schemas-microsoft-com:office:office" xmlns:r="http://schemas.openxmlformats.org/officeDocument/2006/relationships" xmlns:m="http://schemas.openxmlformats.org/officeDocument/2006/math" xmlns:v="urn:schemas-microsoft-com:vml" xmlns:wp14="http://schemas.microsoft.com/office/word/2010/wordprocessingDrawing" xmlns:wp="http://schemas.openxmlformats.org/drawingml/2006/wordprocessingDrawing" xmlns:w10="urn:schemas-microsoft-com:office:word" xmlns:w="http://schemas.openxmlformats.org/wordprocessingml/2006/main" xmlns:w14="http://schemas.microsoft.com/office/word/2010/wordml" xmlns:w15="http://schemas.microsoft.com/office/word/2012/wordml" xmlns:w16cex="http://schemas.microsoft.com/office/word/2018/wordml/cex" xmlns:w16cid="http://schemas.microsoft.com/office/word/2016/wordml/cid" xmlns:w16="http://schemas.microsoft.com/office/word/2018/wordml" xmlns:w16sdtdh="http://schemas.microsoft.com/office/word/2020/wordml/sdtdatahash" xmlns:w16se="http://schemas.microsoft.com/office/word/2015/wordml/symex" xmlns:wpg="http://schemas.microsoft.com/office/word/2010/wordprocessingGroup" xmlns:wpi="http://schemas.microsoft.com/office/word/2010/wordprocessingInk" xmlns:wne="http://schemas.microsoft.com/office/word/2006/wordml" xmlns:wps="http://schemas.microsoft.com/office/word/2010/wordprocessingShape" mc:Ignorable="w14 w15 w16se w16cid w16 w16cex w16sdtdh wp14">
   <w:p>
     <w:pPr>
-      <w:pStyle w:val="Header"/>
+      <w:pStyle w:val="Cabealho"/>
       <w:tabs>
         <w:tab w:val="clear" w:pos="4252"/>
         <w:tab w:val="clear" w:pos="8504"/>
@@ -1092,7 +1093,7 @@
   </w:p>
   <w:p>
     <w:pPr>
-      <w:pStyle w:val="Header"/>
+      <w:pStyle w:val="Cabealho"/>
       <w:tabs>
         <w:tab w:val="clear" w:pos="4252"/>
         <w:tab w:val="clear" w:pos="8504"/>
@@ -1111,7 +1112,7 @@
   </w:p>
   <w:p>
     <w:pPr>
-      <w:pStyle w:val="Header"/>
+      <w:pStyle w:val="Cabealho"/>
       <w:tabs>
         <w:tab w:val="clear" w:pos="4252"/>
         <w:tab w:val="clear" w:pos="8504"/>
@@ -1140,7 +1141,7 @@
 </file>
 
 <file path=word/numbering.xml><?xml version="1.0" encoding="utf-8"?>
-<w:numbering xmlns:wpc="http://schemas.microsoft.com/office/word/2010/wordprocessingCanvas" xmlns:cx="http://schemas.microsoft.com/office/drawing/2014/chartex" xmlns:cx1="http://schemas.microsoft.com/office/drawing/2015/9/8/chartex" xmlns:cx2="http://schemas.microsoft.com/office/drawing/2015/10/21/chartex" xmlns:cx3="http://schemas.microsoft.com/office/drawing/2016/5/9/chartex" xmlns:cx4="http://schemas.microsoft.com/office/drawing/2016/5/10/chartex" xmlns:cx5="http://schemas.microsoft.com/office/drawing/2016/5/11/chartex" xmlns:cx6="http://schemas.microsoft.com/office/drawing/2016/5/12/chartex" xmlns:cx7="http://schemas.microsoft.com/office/drawing/2016/5/13/chartex" xmlns:cx8="http://schemas.microsoft.com/office/drawing/2016/5/14/chartex" xmlns:mc="http://schemas.openxmlformats.org/markup-compatibility/2006" xmlns:aink="http://schemas.microsoft.com/office/drawing/2016/ink" xmlns:am3d="http://schemas.microsoft.com/office/drawing/2017/model3d" xmlns:o="urn:schemas-microsoft-com:office:office" xmlns:oel="http://schemas.microsoft.com/office/2019/extlst" xmlns:r="http://schemas.openxmlformats.org/officeDocument/2006/relationships" xmlns:m="http://schemas.openxmlformats.org/officeDocument/2006/math" xmlns:v="urn:schemas-microsoft-com:vml" xmlns:wp14="http://schemas.microsoft.com/office/word/2010/wordprocessingDrawing" xmlns:wp="http://schemas.openxmlformats.org/drawingml/2006/wordprocessingDrawing" xmlns:w10="urn:schemas-microsoft-com:office:word" xmlns:w="http://schemas.openxmlformats.org/wordprocessingml/2006/main" xmlns:w14="http://schemas.microsoft.com/office/word/2010/wordml" xmlns:w15="http://schemas.microsoft.com/office/word/2012/wordml" xmlns:w16cex="http://schemas.microsoft.com/office/word/2018/wordml/cex" xmlns:w16cid="http://schemas.microsoft.com/office/word/2016/wordml/cid" xmlns:w16="http://schemas.microsoft.com/office/word/2018/wordml" xmlns:w16du="http://schemas.microsoft.com/office/word/2023/wordml/word16du" xmlns:w16sdtdh="http://schemas.microsoft.com/office/word/2020/wordml/sdtdatahash" xmlns:w16sdtfl="http://schemas.microsoft.com/office/word/2024/wordml/sdtformatlock" xmlns:w16se="http://schemas.microsoft.com/office/word/2015/wordml/symex" xmlns:wpg="http://schemas.microsoft.com/office/word/2010/wordprocessingGroup" xmlns:wpi="http://schemas.microsoft.com/office/word/2010/wordprocessingInk" xmlns:wne="http://schemas.microsoft.com/office/word/2006/wordml" xmlns:wps="http://schemas.microsoft.com/office/word/2010/wordprocessingShape" mc:Ignorable="w14 w15 w16se w16cid w16 w16cex w16sdtdh w16sdtfl w16du wp14">
+<w:numbering xmlns:wpc="http://schemas.microsoft.com/office/word/2010/wordprocessingCanvas" xmlns:cx="http://schemas.microsoft.com/office/drawing/2014/chartex" xmlns:cx1="http://schemas.microsoft.com/office/drawing/2015/9/8/chartex" xmlns:cx2="http://schemas.microsoft.com/office/drawing/2015/10/21/chartex" xmlns:cx3="http://schemas.microsoft.com/office/drawing/2016/5/9/chartex" xmlns:cx4="http://schemas.microsoft.com/office/drawing/2016/5/10/chartex" xmlns:cx5="http://schemas.microsoft.com/office/drawing/2016/5/11/chartex" xmlns:cx6="http://schemas.microsoft.com/office/drawing/2016/5/12/chartex" xmlns:cx7="http://schemas.microsoft.com/office/drawing/2016/5/13/chartex" xmlns:cx8="http://schemas.microsoft.com/office/drawing/2016/5/14/chartex" xmlns:mc="http://schemas.openxmlformats.org/markup-compatibility/2006" xmlns:aink="http://schemas.microsoft.com/office/drawing/2016/ink" xmlns:am3d="http://schemas.microsoft.com/office/drawing/2017/model3d" xmlns:o="urn:schemas-microsoft-com:office:office" xmlns:r="http://schemas.openxmlformats.org/officeDocument/2006/relationships" xmlns:m="http://schemas.openxmlformats.org/officeDocument/2006/math" xmlns:v="urn:schemas-microsoft-com:vml" xmlns:wp14="http://schemas.microsoft.com/office/word/2010/wordprocessingDrawing" xmlns:wp="http://schemas.openxmlformats.org/drawingml/2006/wordprocessingDrawing" xmlns:w10="urn:schemas-microsoft-com:office:word" xmlns:w="http://schemas.openxmlformats.org/wordprocessingml/2006/main" xmlns:w14="http://schemas.microsoft.com/office/word/2010/wordml" xmlns:w15="http://schemas.microsoft.com/office/word/2012/wordml" xmlns:w16cex="http://schemas.microsoft.com/office/word/2018/wordml/cex" xmlns:w16cid="http://schemas.microsoft.com/office/word/2016/wordml/cid" xmlns:w16="http://schemas.microsoft.com/office/word/2018/wordml" xmlns:w16sdtdh="http://schemas.microsoft.com/office/word/2020/wordml/sdtdatahash" xmlns:w16se="http://schemas.microsoft.com/office/word/2015/wordml/symex" xmlns:wpg="http://schemas.microsoft.com/office/word/2010/wordprocessingGroup" xmlns:wpi="http://schemas.microsoft.com/office/word/2010/wordprocessingInk" xmlns:wne="http://schemas.microsoft.com/office/word/2006/wordml" xmlns:wps="http://schemas.microsoft.com/office/word/2010/wordprocessingShape" mc:Ignorable="w14 w15 w16se w16cid w16 w16cex w16sdtdh wp14">
   <w:abstractNum w:abstractNumId="0" w15:restartNumberingAfterBreak="0">
     <w:nsid w:val="1CD12703"/>
     <w:multiLevelType w:val="hybridMultilevel"/>
@@ -1367,17 +1368,17 @@
       </w:rPr>
     </w:lvl>
   </w:abstractNum>
-  <w:num w:numId="1" w16cid:durableId="1191727323">
+  <w:num w:numId="1">
     <w:abstractNumId w:val="0"/>
   </w:num>
-  <w:num w:numId="2" w16cid:durableId="1154177572">
+  <w:num w:numId="2">
     <w:abstractNumId w:val="1"/>
   </w:num>
 </w:numbering>
 </file>
 
 <file path=word/styles.xml><?xml version="1.0" encoding="utf-8"?>
-<w:styles xmlns:mc="http://schemas.openxmlformats.org/markup-compatibility/2006" xmlns:r="http://schemas.openxmlformats.org/officeDocument/2006/relationships" xmlns:w="http://schemas.openxmlformats.org/wordprocessingml/2006/main" xmlns:w14="http://schemas.microsoft.com/office/word/2010/wordml" xmlns:w15="http://schemas.microsoft.com/office/word/2012/wordml" xmlns:w16cex="http://schemas.microsoft.com/office/word/2018/wordml/cex" xmlns:w16cid="http://schemas.microsoft.com/office/word/2016/wordml/cid" xmlns:w16="http://schemas.microsoft.com/office/word/2018/wordml" xmlns:w16du="http://schemas.microsoft.com/office/word/2023/wordml/word16du" xmlns:w16sdtdh="http://schemas.microsoft.com/office/word/2020/wordml/sdtdatahash" xmlns:w16sdtfl="http://schemas.microsoft.com/office/word/2024/wordml/sdtformatlock" xmlns:w16se="http://schemas.microsoft.com/office/word/2015/wordml/symex" mc:Ignorable="w14 w15 w16se w16cid w16 w16cex w16sdtdh w16sdtfl w16du">
+<w:styles xmlns:mc="http://schemas.openxmlformats.org/markup-compatibility/2006" xmlns:r="http://schemas.openxmlformats.org/officeDocument/2006/relationships" xmlns:w="http://schemas.openxmlformats.org/wordprocessingml/2006/main" xmlns:w14="http://schemas.microsoft.com/office/word/2010/wordml" xmlns:w15="http://schemas.microsoft.com/office/word/2012/wordml" xmlns:w16cex="http://schemas.microsoft.com/office/word/2018/wordml/cex" xmlns:w16cid="http://schemas.microsoft.com/office/word/2016/wordml/cid" xmlns:w16="http://schemas.microsoft.com/office/word/2018/wordml" xmlns:w16sdtdh="http://schemas.microsoft.com/office/word/2020/wordml/sdtdatahash" xmlns:w16se="http://schemas.microsoft.com/office/word/2015/wordml/symex" mc:Ignorable="w14 w15 w16se w16cid w16 w16cex w16sdtdh">
   <w:docDefaults>
     <w:rPrDefault>
       <w:rPr>
@@ -1785,13 +1786,13 @@
       <w:lang w:eastAsia="pt-BR"/>
     </w:rPr>
   </w:style>
-  <w:style w:type="character" w:default="1" w:styleId="DefaultParagraphFont">
+  <w:style w:type="character" w:default="1" w:styleId="Fontepargpadro">
     <w:name w:val="Default Paragraph Font"/>
     <w:uiPriority w:val="1"/>
     <w:semiHidden/>
     <w:unhideWhenUsed/>
   </w:style>
-  <w:style w:type="table" w:default="1" w:styleId="TableNormal">
+  <w:style w:type="table" w:default="1" w:styleId="Tabelanormal">
     <w:name w:val="Normal Table"/>
     <w:uiPriority w:val="99"/>
     <w:semiHidden/>
@@ -1806,16 +1807,16 @@
       </w:tblCellMar>
     </w:tblPr>
   </w:style>
-  <w:style w:type="numbering" w:default="1" w:styleId="NoList">
+  <w:style w:type="numbering" w:default="1" w:styleId="Semlista">
     <w:name w:val="No List"/>
     <w:uiPriority w:val="99"/>
     <w:semiHidden/>
     <w:unhideWhenUsed/>
   </w:style>
-  <w:style w:type="paragraph" w:styleId="Header">
+  <w:style w:type="paragraph" w:styleId="Cabealho">
     <w:name w:val="header"/>
     <w:basedOn w:val="Normal"/>
-    <w:link w:val="HeaderChar"/>
+    <w:link w:val="CabealhoChar"/>
     <w:uiPriority w:val="99"/>
     <w:unhideWhenUsed/>
     <w:rsid w:val="00C5339A"/>
@@ -1832,17 +1833,17 @@
       <w:lang w:eastAsia="en-US"/>
     </w:rPr>
   </w:style>
-  <w:style w:type="character" w:customStyle="1" w:styleId="HeaderChar">
-    <w:name w:val="Header Char"/>
-    <w:basedOn w:val="DefaultParagraphFont"/>
-    <w:link w:val="Header"/>
+  <w:style w:type="character" w:customStyle="1" w:styleId="CabealhoChar">
+    <w:name w:val="Cabeçalho Char"/>
+    <w:basedOn w:val="Fontepargpadro"/>
+    <w:link w:val="Cabealho"/>
     <w:uiPriority w:val="99"/>
     <w:rsid w:val="00C5339A"/>
   </w:style>
-  <w:style w:type="paragraph" w:styleId="Footer">
+  <w:style w:type="paragraph" w:styleId="Rodap">
     <w:name w:val="footer"/>
     <w:basedOn w:val="Normal"/>
-    <w:link w:val="FooterChar"/>
+    <w:link w:val="RodapChar"/>
     <w:uiPriority w:val="99"/>
     <w:unhideWhenUsed/>
     <w:rsid w:val="00C5339A"/>
@@ -1859,16 +1860,16 @@
       <w:lang w:eastAsia="en-US"/>
     </w:rPr>
   </w:style>
-  <w:style w:type="character" w:customStyle="1" w:styleId="FooterChar">
-    <w:name w:val="Footer Char"/>
-    <w:basedOn w:val="DefaultParagraphFont"/>
-    <w:link w:val="Footer"/>
+  <w:style w:type="character" w:customStyle="1" w:styleId="RodapChar">
+    <w:name w:val="Rodapé Char"/>
+    <w:basedOn w:val="Fontepargpadro"/>
+    <w:link w:val="Rodap"/>
     <w:uiPriority w:val="99"/>
     <w:rsid w:val="00C5339A"/>
   </w:style>
-  <w:style w:type="table" w:styleId="TableGrid">
+  <w:style w:type="table" w:styleId="Tabelacomgrade">
     <w:name w:val="Table Grid"/>
-    <w:basedOn w:val="TableNormal"/>
+    <w:basedOn w:val="Tabelanormal"/>
     <w:uiPriority w:val="39"/>
     <w:rsid w:val="00C5339A"/>
     <w:pPr>
@@ -1885,9 +1886,9 @@
       </w:tblBorders>
     </w:tblPr>
   </w:style>
-  <w:style w:type="character" w:styleId="SubtleEmphasis">
+  <w:style w:type="character" w:styleId="nfaseSutil">
     <w:name w:val="Subtle Emphasis"/>
-    <w:basedOn w:val="DefaultParagraphFont"/>
+    <w:basedOn w:val="Fontepargpadro"/>
     <w:uiPriority w:val="19"/>
     <w:qFormat/>
     <w:rsid w:val="00FA4A86"/>
@@ -1897,7 +1898,7 @@
       <w:color w:val="404040" w:themeColor="text1" w:themeTint="BF"/>
     </w:rPr>
   </w:style>
-  <w:style w:type="paragraph" w:styleId="ListParagraph">
+  <w:style w:type="paragraph" w:styleId="PargrafodaLista">
     <w:name w:val="List Paragraph"/>
     <w:basedOn w:val="Normal"/>
     <w:uiPriority w:val="34"/>

</xml_diff>